<commit_message>
Corrige loop de itens do TR: {%tr for/endfor %} em linhas separadas
</commit_message>
<xml_diff>
--- a/backend/templates/template_tr.docx
+++ b/backend/templates/template_tr.docx
@@ -253,7 +253,169 @@
               <w:rPr>
                 <w:color w:val="FF0000"/>
               </w:rPr>
-              <w:t>{%tr for it in itens %}{{ it.numero }}</w:t>
+              <w:t>{%tr for it in itens %}</w:t>
+            </w:r>
+          </w:p>
+        </w:tc>
+        <w:tc>
+          <w:tcPr>
+            <w:tcW w:w="1126" w:type="pct"/>
+            <w:tcBorders>
+              <w:top w:val="nil"/>
+              <w:left w:val="single" w:sz="4" w:space="0" w:color="auto"/>
+              <w:bottom w:val="single" w:sz="8" w:space="0" w:color="auto"/>
+              <w:right w:val="single" w:sz="8" w:space="0" w:color="auto"/>
+            </w:tcBorders>
+            <w:tcMar>
+              <w:top w:w="0" w:type="dxa"/>
+              <w:left w:w="70" w:type="dxa"/>
+              <w:bottom w:w="0" w:type="dxa"/>
+              <w:right w:w="70" w:type="dxa"/>
+            </w:tcMar>
+            <w:vAlign w:val="center"/>
+            <w:hideMark/>
+          </w:tcPr>
+          <w:p>
+            <w:pPr>
+              <w:pStyle w:val="PGE-Normal"/>
+            </w:pPr>
+            <w:r/>
+          </w:p>
+        </w:tc>
+        <w:tc>
+          <w:tcPr>
+            <w:tcW w:w="658" w:type="pct"/>
+            <w:tcBorders>
+              <w:top w:val="nil"/>
+              <w:left w:val="nil"/>
+              <w:bottom w:val="single" w:sz="8" w:space="0" w:color="auto"/>
+              <w:right w:val="single" w:sz="8" w:space="0" w:color="auto"/>
+            </w:tcBorders>
+            <w:tcMar>
+              <w:top w:w="0" w:type="dxa"/>
+              <w:left w:w="70" w:type="dxa"/>
+              <w:bottom w:w="0" w:type="dxa"/>
+              <w:right w:w="70" w:type="dxa"/>
+            </w:tcMar>
+            <w:vAlign w:val="center"/>
+            <w:hideMark/>
+          </w:tcPr>
+          <w:p>
+            <w:pPr>
+              <w:pStyle w:val="PGE-Normal"/>
+            </w:pPr>
+            <w:r/>
+          </w:p>
+        </w:tc>
+        <w:tc>
+          <w:tcPr>
+            <w:tcW w:w="734" w:type="pct"/>
+            <w:tcBorders>
+              <w:top w:val="nil"/>
+              <w:left w:val="nil"/>
+              <w:bottom w:val="single" w:sz="8" w:space="0" w:color="auto"/>
+              <w:right w:val="single" w:sz="8" w:space="0" w:color="auto"/>
+            </w:tcBorders>
+            <w:tcMar>
+              <w:top w:w="0" w:type="dxa"/>
+              <w:left w:w="70" w:type="dxa"/>
+              <w:bottom w:w="0" w:type="dxa"/>
+              <w:right w:w="70" w:type="dxa"/>
+            </w:tcMar>
+            <w:vAlign w:val="center"/>
+            <w:hideMark/>
+          </w:tcPr>
+          <w:p>
+            <w:pPr>
+              <w:pStyle w:val="PGE-Normal"/>
+            </w:pPr>
+            <w:r/>
+          </w:p>
+        </w:tc>
+        <w:tc>
+          <w:tcPr>
+            <w:tcW w:w="1012" w:type="pct"/>
+            <w:tcBorders>
+              <w:top w:val="nil"/>
+              <w:left w:val="nil"/>
+              <w:bottom w:val="single" w:sz="8" w:space="0" w:color="auto"/>
+              <w:right w:val="single" w:sz="8" w:space="0" w:color="auto"/>
+            </w:tcBorders>
+            <w:tcMar>
+              <w:top w:w="0" w:type="dxa"/>
+              <w:left w:w="70" w:type="dxa"/>
+              <w:bottom w:w="0" w:type="dxa"/>
+              <w:right w:w="70" w:type="dxa"/>
+            </w:tcMar>
+            <w:vAlign w:val="center"/>
+            <w:hideMark/>
+          </w:tcPr>
+          <w:p>
+            <w:pPr>
+              <w:pStyle w:val="PGE-Normal"/>
+            </w:pPr>
+            <w:r/>
+          </w:p>
+        </w:tc>
+        <w:tc>
+          <w:tcPr>
+            <w:tcW w:w="1012" w:type="pct"/>
+            <w:tcBorders>
+              <w:top w:val="nil"/>
+              <w:left w:val="nil"/>
+              <w:bottom w:val="single" w:sz="8" w:space="0" w:color="auto"/>
+              <w:right w:val="single" w:sz="8" w:space="0" w:color="auto"/>
+            </w:tcBorders>
+            <w:tcMar>
+              <w:top w:w="0" w:type="dxa"/>
+              <w:left w:w="70" w:type="dxa"/>
+              <w:bottom w:w="0" w:type="dxa"/>
+              <w:right w:w="70" w:type="dxa"/>
+            </w:tcMar>
+            <w:vAlign w:val="center"/>
+          </w:tcPr>
+          <w:p>
+            <w:pPr>
+              <w:pStyle w:val="PGE-Normal"/>
+            </w:pPr>
+            <w:r/>
+          </w:p>
+        </w:tc>
+      </w:tr>
+      <w:tr>
+        <w:trPr>
+          <w:trHeight w:val="315"/>
+        </w:trPr>
+        <w:tc>
+          <w:tcPr>
+            <w:tcW w:w="457" w:type="pct"/>
+            <w:tcBorders>
+              <w:top w:val="nil"/>
+              <w:left w:val="single" w:sz="4" w:space="0" w:color="auto"/>
+              <w:bottom w:val="single" w:sz="8" w:space="0" w:color="auto"/>
+              <w:right w:val="single" w:sz="4" w:space="0" w:color="auto"/>
+            </w:tcBorders>
+            <w:tcMar>
+              <w:top w:w="0" w:type="dxa"/>
+              <w:left w:w="70" w:type="dxa"/>
+              <w:bottom w:w="0" w:type="dxa"/>
+              <w:right w:w="70" w:type="dxa"/>
+            </w:tcMar>
+            <w:vAlign w:val="center"/>
+            <w:hideMark/>
+          </w:tcPr>
+          <w:p>
+            <w:pPr>
+              <w:pStyle w:val="PGE-Normal"/>
+              <w:rPr>
+                <w:color w:val="FF0000"/>
+              </w:rPr>
+            </w:pPr>
+            <w:r>
+              <w:rPr>
+                <w:color w:val="FF0000"/>
+              </w:rPr>
+              <w:t>{{ it.numero }}</w:t>
             </w:r>
           </w:p>
         </w:tc>
@@ -387,8 +549,165 @@
               <w:pStyle w:val="PGE-Normal"/>
             </w:pPr>
             <w:r>
-              <w:t>{{ it.valor_total }}{%tr endfor %}</w:t>
+              <w:t>{{ it.valor_total }}</w:t>
             </w:r>
+          </w:p>
+        </w:tc>
+      </w:tr>
+      <w:tr>
+        <w:trPr>
+          <w:trHeight w:val="315"/>
+        </w:trPr>
+        <w:tc>
+          <w:tcPr>
+            <w:tcW w:w="457" w:type="pct"/>
+            <w:tcBorders>
+              <w:top w:val="nil"/>
+              <w:left w:val="single" w:sz="4" w:space="0" w:color="auto"/>
+              <w:bottom w:val="single" w:sz="4" w:space="0" w:color="auto"/>
+              <w:right w:val="single" w:sz="4" w:space="0" w:color="auto"/>
+            </w:tcBorders>
+            <w:tcMar>
+              <w:top w:w="0" w:type="dxa"/>
+              <w:left w:w="70" w:type="dxa"/>
+              <w:bottom w:w="0" w:type="dxa"/>
+              <w:right w:w="70" w:type="dxa"/>
+            </w:tcMar>
+            <w:vAlign w:val="center"/>
+          </w:tcPr>
+          <w:p>
+            <w:pPr>
+              <w:pStyle w:val="PGE-Normal"/>
+              <w:rPr>
+                <w:color w:val="FF0000"/>
+              </w:rPr>
+            </w:pPr>
+            <w:r>
+              <w:rPr>
+                <w:color w:val="FF0000"/>
+              </w:rPr>
+              <w:t>{%tr endfor %}</w:t>
+            </w:r>
+          </w:p>
+        </w:tc>
+        <w:tc>
+          <w:tcPr>
+            <w:tcW w:w="1126" w:type="pct"/>
+            <w:tcBorders>
+              <w:top w:val="nil"/>
+              <w:left w:val="single" w:sz="4" w:space="0" w:color="auto"/>
+              <w:bottom w:val="single" w:sz="4" w:space="0" w:color="auto"/>
+              <w:right w:val="single" w:sz="8" w:space="0" w:color="auto"/>
+            </w:tcBorders>
+            <w:tcMar>
+              <w:top w:w="0" w:type="dxa"/>
+              <w:left w:w="70" w:type="dxa"/>
+              <w:bottom w:w="0" w:type="dxa"/>
+              <w:right w:w="70" w:type="dxa"/>
+            </w:tcMar>
+            <w:vAlign w:val="center"/>
+          </w:tcPr>
+          <w:p>
+            <w:pPr>
+              <w:pStyle w:val="PGE-Normal"/>
+            </w:pPr>
+            <w:r/>
+          </w:p>
+        </w:tc>
+        <w:tc>
+          <w:tcPr>
+            <w:tcW w:w="658" w:type="pct"/>
+            <w:tcBorders>
+              <w:top w:val="nil"/>
+              <w:left w:val="nil"/>
+              <w:bottom w:val="single" w:sz="4" w:space="0" w:color="auto"/>
+              <w:right w:val="single" w:sz="8" w:space="0" w:color="auto"/>
+            </w:tcBorders>
+            <w:tcMar>
+              <w:top w:w="0" w:type="dxa"/>
+              <w:left w:w="70" w:type="dxa"/>
+              <w:bottom w:w="0" w:type="dxa"/>
+              <w:right w:w="70" w:type="dxa"/>
+            </w:tcMar>
+            <w:vAlign w:val="center"/>
+          </w:tcPr>
+          <w:p>
+            <w:pPr>
+              <w:pStyle w:val="PGE-Normal"/>
+            </w:pPr>
+            <w:r/>
+          </w:p>
+        </w:tc>
+        <w:tc>
+          <w:tcPr>
+            <w:tcW w:w="734" w:type="pct"/>
+            <w:tcBorders>
+              <w:top w:val="nil"/>
+              <w:left w:val="nil"/>
+              <w:bottom w:val="single" w:sz="4" w:space="0" w:color="auto"/>
+              <w:right w:val="single" w:sz="8" w:space="0" w:color="auto"/>
+            </w:tcBorders>
+            <w:tcMar>
+              <w:top w:w="0" w:type="dxa"/>
+              <w:left w:w="70" w:type="dxa"/>
+              <w:bottom w:w="0" w:type="dxa"/>
+              <w:right w:w="70" w:type="dxa"/>
+            </w:tcMar>
+            <w:vAlign w:val="center"/>
+          </w:tcPr>
+          <w:p>
+            <w:pPr>
+              <w:pStyle w:val="PGE-Normal"/>
+            </w:pPr>
+            <w:r/>
+          </w:p>
+        </w:tc>
+        <w:tc>
+          <w:tcPr>
+            <w:tcW w:w="1012" w:type="pct"/>
+            <w:tcBorders>
+              <w:top w:val="nil"/>
+              <w:left w:val="nil"/>
+              <w:bottom w:val="single" w:sz="4" w:space="0" w:color="auto"/>
+              <w:right w:val="single" w:sz="8" w:space="0" w:color="auto"/>
+            </w:tcBorders>
+            <w:tcMar>
+              <w:top w:w="0" w:type="dxa"/>
+              <w:left w:w="70" w:type="dxa"/>
+              <w:bottom w:w="0" w:type="dxa"/>
+              <w:right w:w="70" w:type="dxa"/>
+            </w:tcMar>
+            <w:vAlign w:val="center"/>
+          </w:tcPr>
+          <w:p>
+            <w:pPr>
+              <w:pStyle w:val="PGE-Normal"/>
+            </w:pPr>
+            <w:r/>
+          </w:p>
+        </w:tc>
+        <w:tc>
+          <w:tcPr>
+            <w:tcW w:w="1012" w:type="pct"/>
+            <w:tcBorders>
+              <w:top w:val="nil"/>
+              <w:left w:val="nil"/>
+              <w:bottom w:val="single" w:sz="4" w:space="0" w:color="auto"/>
+              <w:right w:val="single" w:sz="8" w:space="0" w:color="auto"/>
+            </w:tcBorders>
+            <w:tcMar>
+              <w:top w:w="0" w:type="dxa"/>
+              <w:left w:w="70" w:type="dxa"/>
+              <w:bottom w:w="0" w:type="dxa"/>
+              <w:right w:w="70" w:type="dxa"/>
+            </w:tcMar>
+            <w:vAlign w:val="center"/>
+          </w:tcPr>
+          <w:p>
+            <w:pPr>
+              <w:pStyle w:val="PGE-Normal"/>
+            </w:pPr>
+            <w:r/>
           </w:p>
         </w:tc>
       </w:tr>

</xml_diff>